<commit_message>
alterei o sprint backlog
</commit_message>
<xml_diff>
--- a/SPRINT BACKLOG.docx
+++ b/SPRINT BACKLOG.docx
@@ -176,7 +176,7 @@
               <w:jc w:val="center"/>
             </w:pPr>
             <w:r>
-              <w:t>12 minutos</w:t>
+              <w:t>Fácil</w:t>
             </w:r>
           </w:p>
         </w:tc>
@@ -220,7 +220,7 @@
               <w:jc w:val="center"/>
             </w:pPr>
             <w:r>
-              <w:t>10 minutos</w:t>
+              <w:t xml:space="preserve">Fácil </w:t>
             </w:r>
           </w:p>
         </w:tc>
@@ -847,6 +847,7 @@
   <w:style w:type="character" w:default="1" w:styleId="Fontepargpadro">
     <w:name w:val="Default Paragraph Font"/>
     <w:uiPriority w:val="1"/>
+    <w:semiHidden/>
     <w:unhideWhenUsed/>
   </w:style>
   <w:style w:type="table" w:default="1" w:styleId="Tabelanormal">

</xml_diff>